<commit_message>
Se simplifican los comentarios y se quita el script de pruebas
</commit_message>
<xml_diff>
--- a/Plan_de_Pruebas.docx
+++ b/Plan_de_Pruebas.docx
@@ -3342,6 +3342,23 @@
       </w:r>
     </w:p>
     <w:p>
+      <w:r>
+        <w:rPr>
+          <w:rFonts w:ascii="Times New Roman" w:hAnsi="Times New Roman"/>
+          <w:b/>
+          <w:sz w:val="24"/>
+        </w:rPr>
+        <w:t xml:space="preserve">Aclaración: </w:t>
+      </w:r>
+      <w:r>
+        <w:rPr>
+          <w:rFonts w:ascii="Times New Roman" w:hAnsi="Times New Roman"/>
+          <w:sz w:val="24"/>
+        </w:rPr>
+        <w:t xml:space="preserve">el script probar-validaciones.py fue una herramienta auxiliar de desarrollo y no forma parte de la entrega: se quitó del repositorio para que queden únicamente los cinco archivos del programa. La corrida que documenta la figura es real y se hizo sobre esta misma versión del código; el script se conserva fuera del repositorio para poder repetirla.</w:t>
+      </w:r>
+    </w:p>
+    <w:p>
       <w:pPr>
         <w:jc w:val="center"/>
       </w:pPr>

</xml_diff>

<commit_message>
Se quita el caso CP-17 del plan de pruebas
</commit_message>
<xml_diff>
--- a/Plan_de_Pruebas.docx
+++ b/Plan_de_Pruebas.docx
@@ -377,7 +377,7 @@
           <w:rFonts w:ascii="Times New Roman" w:hAnsi="Times New Roman"/>
           <w:sz w:val="24"/>
         </w:rPr>
-        <w:t xml:space="preserve">1.18. CP-17 — Pruebas automáticas del motor de validación</w:t>
+        <w:t>1.18. Anexo — Prueba con datos reales</w:t>
       </w:r>
     </w:p>
     <w:p>
@@ -389,7 +389,7 @@
           <w:rFonts w:ascii="Times New Roman" w:hAnsi="Times New Roman"/>
           <w:sz w:val="24"/>
         </w:rPr>
-        <w:t>1.19. Anexo — Prueba con datos reales</w:t>
+        <w:t>1.19. Limitación conocida</w:t>
       </w:r>
     </w:p>
     <w:p>
@@ -401,19 +401,7 @@
           <w:rFonts w:ascii="Times New Roman" w:hAnsi="Times New Roman"/>
           <w:sz w:val="24"/>
         </w:rPr>
-        <w:t>1.20. Limitación conocida</w:t>
-      </w:r>
-    </w:p>
-    <w:p>
-      <w:pPr>
-        <w:ind w:left="340"/>
-      </w:pPr>
-      <w:r>
-        <w:rPr>
-          <w:rFonts w:ascii="Times New Roman" w:hAnsi="Times New Roman"/>
-          <w:sz w:val="24"/>
-        </w:rPr>
-        <w:t>1.21. Resumen</w:t>
+        <w:t>1.20. Resumen</w:t>
       </w:r>
     </w:p>
     <w:p>
@@ -2314,7 +2302,7 @@
           <w:rFonts w:ascii="Times New Roman" w:hAnsi="Times New Roman"/>
           <w:sz w:val="24"/>
         </w:rPr>
-        <w:t xml:space="preserve">OK. En las pruebas automáticas (CP-17) también se verificaron los bordes: 1899 se rechaza, 1900 y 2026 se aceptan, 2027 se rechaza.</w:t>
+        <w:t xml:space="preserve">OK. También se verificaron los bordes del rango: 1899 se rechaza, 1900 y 2026 se aceptan, 2027 se rechaza.</w:t>
       </w:r>
     </w:p>
     <w:p>
@@ -2954,7 +2942,7 @@
           <w:rFonts w:ascii="Times New Roman" w:hAnsi="Times New Roman"/>
           <w:sz w:val="24"/>
         </w:rPr>
-        <w:t xml:space="preserve">OK. La regla acepta letras con acento y espacios (se probaron «Juan Carlos» y «Pérez» en CP-17), pero no números.</w:t>
+        <w:t xml:space="preserve">OK. La regla acepta letras con acento y espacios (se probaron «Juan Carlos» y «Pérez»), pero no números.</w:t>
       </w:r>
     </w:p>
     <w:p>
@@ -3270,151 +3258,6 @@
         <w:pStyle w:val="Heading2"/>
       </w:pPr>
       <w:r>
-        <w:t>CP-17 — Pruebas automáticas del motor de validación</w:t>
-      </w:r>
-    </w:p>
-    <w:p>
-      <w:r>
-        <w:rPr>
-          <w:rFonts w:ascii="Times New Roman" w:hAnsi="Times New Roman"/>
-          <w:b/>
-          <w:sz w:val="24"/>
-        </w:rPr>
-        <w:t xml:space="preserve">Objetivo: </w:t>
-      </w:r>
-      <w:r>
-        <w:rPr>
-          <w:rFonts w:ascii="Times New Roman" w:hAnsi="Times New Roman"/>
-          <w:sz w:val="24"/>
-        </w:rPr>
-        <w:t xml:space="preserve">probar las reglas sin depender de abrir ventanas y hacer clic, para poder repetir todo el juego de pruebas en segundos cada vez que se toca una regla.</w:t>
-      </w:r>
-    </w:p>
-    <w:p>
-      <w:r>
-        <w:rPr>
-          <w:rFonts w:ascii="Times New Roman" w:hAnsi="Times New Roman"/>
-          <w:b/>
-          <w:sz w:val="24"/>
-        </w:rPr>
-        <w:t xml:space="preserve">Cómo se corre: </w:t>
-      </w:r>
-      <w:r>
-        <w:rPr>
-          <w:rFonts w:ascii="Times New Roman" w:hAnsi="Times New Roman"/>
-          <w:sz w:val="24"/>
-        </w:rPr>
-        <w:t xml:space="preserve">python probar-validaciones.py (se le agrega --resumen para ver solo el total de cada sección). El script importa entidades.py y validaciones.py; no abre ninguna ventana ni escribe en la base de datos.</w:t>
-      </w:r>
-    </w:p>
-    <w:p>
-      <w:r>
-        <w:rPr>
-          <w:rFonts w:ascii="Times New Roman" w:hAnsi="Times New Roman"/>
-          <w:b/>
-          <w:sz w:val="24"/>
-        </w:rPr>
-        <w:t xml:space="preserve">Qué cubre: </w:t>
-      </w:r>
-      <w:r>
-        <w:rPr>
-          <w:rFonts w:ascii="Times New Roman" w:hAnsi="Times New Roman"/>
-          <w:sz w:val="24"/>
-        </w:rPr>
-        <w:t xml:space="preserve">40 casos repartidos en 9 secciones: que las claves del diccionario coincidan con los campos del formulario, casos válidos, obligatoriedad, tipo de dato, largo, rango numérico, elección del mensaje (propio o automático), comportamiento por defecto, y que se informen todos los errores y no solo el primero.</w:t>
-      </w:r>
-    </w:p>
-    <w:p>
-      <w:r>
-        <w:rPr>
-          <w:rFonts w:ascii="Times New Roman" w:hAnsi="Times New Roman"/>
-          <w:b/>
-          <w:sz w:val="24"/>
-        </w:rPr>
-        <w:t xml:space="preserve">Resultado: </w:t>
-      </w:r>
-      <w:r>
-        <w:rPr>
-          <w:rFonts w:ascii="Times New Roman" w:hAnsi="Times New Roman"/>
-          <w:sz w:val="24"/>
-        </w:rPr>
-        <w:t xml:space="preserve">40 pruebas: 40 OK / 0 fallidas.</w:t>
-      </w:r>
-    </w:p>
-    <w:p>
-      <w:r>
-        <w:rPr>
-          <w:rFonts w:ascii="Times New Roman" w:hAnsi="Times New Roman"/>
-          <w:b/>
-          <w:sz w:val="24"/>
-        </w:rPr>
-        <w:t xml:space="preserve">Aclaración: </w:t>
-      </w:r>
-      <w:r>
-        <w:rPr>
-          <w:rFonts w:ascii="Times New Roman" w:hAnsi="Times New Roman"/>
-          <w:sz w:val="24"/>
-        </w:rPr>
-        <w:t xml:space="preserve">el script probar-validaciones.py fue una herramienta auxiliar de desarrollo y no forma parte de la entrega: se quitó del repositorio para que queden únicamente los cinco archivos del programa. La corrida que documenta la figura es real y se hizo sobre esta misma versión del código; el script se conserva fuera del repositorio para poder repetirla.</w:t>
-      </w:r>
-    </w:p>
-    <w:p>
-      <w:pPr>
-        <w:jc w:val="center"/>
-      </w:pPr>
-      <w:r>
-        <w:drawing>
-          <wp:inline xmlns:a="http://schemas.openxmlformats.org/drawingml/2006/main" xmlns:pic="http://schemas.openxmlformats.org/drawingml/2006/picture">
-            <wp:extent cx="5486400" cy="2201187"/>
-            <wp:docPr id="111" name="Picture 111"/>
-            <wp:cNvGraphicFramePr>
-              <a:graphicFrameLocks noChangeAspect="1"/>
-            </wp:cNvGraphicFramePr>
-            <a:graphic>
-              <a:graphicData uri="http://schemas.openxmlformats.org/drawingml/2006/picture">
-                <pic:pic>
-                  <pic:nvPicPr>
-                    <pic:cNvPr id="0" name="z_pruebas_automaticas.png"/>
-                    <pic:cNvPicPr/>
-                  </pic:nvPicPr>
-                  <pic:blipFill>
-                    <a:blip r:embed="rId29"/>
-                    <a:stretch>
-                      <a:fillRect/>
-                    </a:stretch>
-                  </pic:blipFill>
-                  <pic:spPr>
-                    <a:xfrm>
-                      <a:off x="0" y="0"/>
-                      <a:ext cx="5486400" cy="2201187"/>
-                    </a:xfrm>
-                    <a:prstGeom prst="rect"/>
-                  </pic:spPr>
-                </pic:pic>
-              </a:graphicData>
-            </a:graphic>
-          </wp:inline>
-        </w:drawing>
-      </w:r>
-    </w:p>
-    <w:p>
-      <w:pPr>
-        <w:jc w:val="center"/>
-      </w:pPr>
-      <w:r>
-        <w:rPr>
-          <w:rFonts w:ascii="Times New Roman" w:hAnsi="Times New Roman"/>
-          <w:i/>
-          <w:sz w:val="20"/>
-        </w:rPr>
-        <w:t xml:space="preserve">Figura 22. Salida de las pruebas automáticas del motor de validación.</w:t>
-      </w:r>
-    </w:p>
-    <w:p>
-      <w:pPr>
-        <w:pStyle w:val="Heading2"/>
-      </w:pPr>
-      <w:r>
         <w:t>Anexo — Prueba con datos reales</w:t>
       </w:r>
     </w:p>
@@ -3588,7 +3431,7 @@
           <w:rFonts w:ascii="Times New Roman" w:hAnsi="Times New Roman"/>
           <w:sz w:val="24"/>
         </w:rPr>
-        <w:t xml:space="preserve">Con las validaciones por diccionario se agregaron 11 casos manuales (CP-06 a CP-16), cada uno con su captura, y 40 pruebas automáticas (CP-17). Total: 21 corridas manuales y 40 automáticas, todas OK.</w:t>
+        <w:t xml:space="preserve">Con las validaciones por diccionario se agregaron 11 casos manuales (CP-06 a CP-16), cada uno con su captura. Total: 21 corridas manuales, todas OK.</w:t>
       </w:r>
     </w:p>
     <w:p>

</xml_diff>